<commit_message>
Add Checkpoint 3.1 worksheet PDF, update worksheet, ignore stray ragas_experiments/
Commits the worksheet PDF export and the latest worksheet docx, and adds the root-level ragas_experiments/ (lab 3.1 email output) to .gitignore. The capstone ragas_experiments_3_1/ folder remains tracked.
</commit_message>
<xml_diff>
--- a/Final_Capstone_Project/Capstone_Checkpoint_3.1/MHerrera_Capstone_Checkpoint_3_1_Worksheet.docx
+++ b/Final_Capstone_Project/Capstone_Checkpoint_3.1/MHerrera_Capstone_Checkpoint_3_1_Worksheet.docx
@@ -1239,19 +1239,8 @@
                 <w:sz w:val="24"/>
                 <w:szCs w:val="24"/>
               </w:rPr>
-              <w:t xml:space="preserve"> </w:t>
-            </w:r>
-            <w:proofErr w:type="gramStart"/>
-            <w:r>
-              <w:rPr>
-                <w:b/>
-                <w:bCs/>
-                <w:sz w:val="24"/>
-                <w:szCs w:val="24"/>
-              </w:rPr>
-              <w:t>rephrasing</w:t>
-            </w:r>
-            <w:proofErr w:type="gramEnd"/>
+              <w:t xml:space="preserve"> rephrasing</w:t>
+            </w:r>
             <w:r>
               <w:rPr>
                 <w:sz w:val="24"/>
@@ -1614,39 +1603,7 @@
                 <w:sz w:val="24"/>
                 <w:szCs w:val="24"/>
               </w:rPr>
-              <w:t xml:space="preserve">. Robustness to </w:t>
-            </w:r>
-            <w:proofErr w:type="gramStart"/>
-            <w:r>
-              <w:rPr>
-                <w:sz w:val="24"/>
-                <w:szCs w:val="24"/>
-              </w:rPr>
-              <w:t>rephrasing</w:t>
-            </w:r>
-            <w:proofErr w:type="gramEnd"/>
-            <w:r>
-              <w:rPr>
-                <w:sz w:val="24"/>
-                <w:szCs w:val="24"/>
-              </w:rPr>
-              <w:t xml:space="preserve"> matters because real users phrase the same question many ways; measuring the originals-vs-paraphrases delta tells us whether the retriever is brittle. A RAGAS LLM judge </w:t>
-            </w:r>
-            <w:proofErr w:type="gramStart"/>
-            <w:r>
-              <w:rPr>
-                <w:sz w:val="24"/>
-                <w:szCs w:val="24"/>
-              </w:rPr>
-              <w:t>scales to</w:t>
-            </w:r>
-            <w:proofErr w:type="gramEnd"/>
-            <w:r>
-              <w:rPr>
-                <w:sz w:val="24"/>
-                <w:szCs w:val="24"/>
-              </w:rPr>
-              <w:t xml:space="preserve"> hundreds of questions where manual grading would not, and grading notes keep the judgment anchored to specific required facts.</w:t>
+              <w:t>. Robustness to rephrasing matters because real users phrase the same question many ways; measuring the originals-vs-paraphrases delta tells us whether the retriever is brittle. A RAGAS LLM judge scales to hundreds of questions where manual grading would not, and grading notes keep the judgment anchored to specific required facts.</w:t>
             </w:r>
           </w:p>
         </w:tc>
@@ -1922,9 +1879,16 @@
                 <w:sz w:val="24"/>
                 <w:szCs w:val="24"/>
               </w:rPr>
-              <w:t>test_main_</w:t>
-            </w:r>
-            <w:proofErr w:type="gramStart"/>
+              <w:t>test_main_questions.json</w:t>
+            </w:r>
+            <w:proofErr w:type="spellEnd"/>
+            <w:r>
+              <w:rPr>
+                <w:sz w:val="24"/>
+                <w:szCs w:val="24"/>
+              </w:rPr>
+              <w:t>) spanning people, places, sports, film, music, geography, history, and science. I then ran a second generator (</w:t>
+            </w:r>
             <w:r>
               <w:rPr>
                 <w:b/>
@@ -1932,71 +1896,26 @@
                 <w:sz w:val="24"/>
                 <w:szCs w:val="24"/>
               </w:rPr>
-              <w:t>questions.json</w:t>
+              <w:t>generate_variants.py</w:t>
+            </w:r>
+            <w:r>
+              <w:rPr>
+                <w:sz w:val="24"/>
+                <w:szCs w:val="24"/>
+              </w:rPr>
+              <w:t>, following the Lab 3.2 paraphrase logic) that produced 2 paraphrases per question, each reusing its original's grading notes and sources (</w:t>
+            </w:r>
+            <w:proofErr w:type="spellStart"/>
+            <w:r>
+              <w:rPr>
+                <w:b/>
+                <w:bCs/>
+                <w:sz w:val="24"/>
+                <w:szCs w:val="24"/>
+              </w:rPr>
+              <w:t>testinputs_variant_questions.json</w:t>
             </w:r>
             <w:proofErr w:type="spellEnd"/>
-            <w:proofErr w:type="gramEnd"/>
-            <w:r>
-              <w:rPr>
-                <w:sz w:val="24"/>
-                <w:szCs w:val="24"/>
-              </w:rPr>
-              <w:t xml:space="preserve">) spanning people, places, sports, </w:t>
-            </w:r>
-            <w:proofErr w:type="gramStart"/>
-            <w:r>
-              <w:rPr>
-                <w:sz w:val="24"/>
-                <w:szCs w:val="24"/>
-              </w:rPr>
-              <w:t>film</w:t>
-            </w:r>
-            <w:proofErr w:type="gramEnd"/>
-            <w:r>
-              <w:rPr>
-                <w:sz w:val="24"/>
-                <w:szCs w:val="24"/>
-              </w:rPr>
-              <w:t>, music, geography, history, and science. I then ran a second generator (</w:t>
-            </w:r>
-            <w:r>
-              <w:rPr>
-                <w:b/>
-                <w:bCs/>
-                <w:sz w:val="24"/>
-                <w:szCs w:val="24"/>
-              </w:rPr>
-              <w:t>generate_variants.py</w:t>
-            </w:r>
-            <w:r>
-              <w:rPr>
-                <w:sz w:val="24"/>
-                <w:szCs w:val="24"/>
-              </w:rPr>
-              <w:t>, following the Lab 3.2 paraphrase logic) that produced 2 paraphrases per question, each reusing its original's grading notes and sources (</w:t>
-            </w:r>
-            <w:proofErr w:type="spellStart"/>
-            <w:r>
-              <w:rPr>
-                <w:b/>
-                <w:bCs/>
-                <w:sz w:val="24"/>
-                <w:szCs w:val="24"/>
-              </w:rPr>
-              <w:t>testinputs_variant_</w:t>
-            </w:r>
-            <w:proofErr w:type="gramStart"/>
-            <w:r>
-              <w:rPr>
-                <w:b/>
-                <w:bCs/>
-                <w:sz w:val="24"/>
-                <w:szCs w:val="24"/>
-              </w:rPr>
-              <w:t>questions.json</w:t>
-            </w:r>
-            <w:proofErr w:type="spellEnd"/>
-            <w:proofErr w:type="gramEnd"/>
             <w:r>
               <w:rPr>
                 <w:sz w:val="24"/>
@@ -2246,18 +2165,9 @@
                 <w:sz w:val="24"/>
                 <w:szCs w:val="24"/>
               </w:rPr>
-              <w:t>test_main_</w:t>
-            </w:r>
-            <w:proofErr w:type="gramStart"/>
-            <w:r>
-              <w:rPr>
-                <w:sz w:val="24"/>
-                <w:szCs w:val="24"/>
-              </w:rPr>
-              <w:t>questions.json</w:t>
+              <w:t>test_main_questions.json</w:t>
             </w:r>
             <w:proofErr w:type="spellEnd"/>
-            <w:proofErr w:type="gramEnd"/>
             <w:r>
               <w:rPr>
                 <w:sz w:val="24"/>
@@ -2354,23 +2264,7 @@
                 <w:sz w:val="24"/>
                 <w:szCs w:val="24"/>
               </w:rPr>
-              <w:t xml:space="preserve"> provider error: "You requested up to 65536 </w:t>
-            </w:r>
-            <w:proofErr w:type="gramStart"/>
-            <w:r>
-              <w:rPr>
-                <w:sz w:val="24"/>
-                <w:szCs w:val="24"/>
-              </w:rPr>
-              <w:t>tokens, but</w:t>
-            </w:r>
-            <w:proofErr w:type="gramEnd"/>
-            <w:r>
-              <w:rPr>
-                <w:sz w:val="24"/>
-                <w:szCs w:val="24"/>
-              </w:rPr>
-              <w:t xml:space="preserve"> can only afford 54757." This is a token-budget error, not a code bug: for those requests the prompt plus the requested max output tokens </w:t>
+              <w:t xml:space="preserve"> provider error: "You requested up to 65536 tokens, but can only afford 54757." This is a token-budget error, not a code bug: for those requests the prompt plus the requested max output tokens </w:t>
             </w:r>
             <w:r>
               <w:rPr>
@@ -2402,23 +2296,7 @@
                 <w:sz w:val="24"/>
                 <w:szCs w:val="24"/>
               </w:rPr>
-              <w:t xml:space="preserve"> of the top 4 Wikipedia articles as context, and some articles are very long, so the input prompt inflates and collides with the output token budget. Mitigations are to truncate each retrieved article's text (e.g., a per-document character cap), reduce </w:t>
-            </w:r>
-            <w:proofErr w:type="gramStart"/>
-            <w:r>
-              <w:rPr>
-                <w:sz w:val="24"/>
-                <w:szCs w:val="24"/>
-              </w:rPr>
-              <w:t>Top-K</w:t>
-            </w:r>
-            <w:proofErr w:type="gramEnd"/>
-            <w:r>
-              <w:rPr>
-                <w:sz w:val="24"/>
-                <w:szCs w:val="24"/>
-              </w:rPr>
-              <w:t xml:space="preserve">, and keep the answer </w:t>
+              <w:t xml:space="preserve"> of the top 4 Wikipedia articles as context, and some articles are very long, so the input prompt inflates and collides with the output token budget. Mitigations are to truncate each retrieved article's text (e.g., a per-document character cap), reduce Top-K, and keep the answer </w:t>
             </w:r>
             <w:proofErr w:type="spellStart"/>
             <w:r>
@@ -2645,25 +2523,7 @@
                 <w:szCs w:val="24"/>
                 <w:u w:val="single"/>
               </w:rPr>
-              <w:t xml:space="preserve">the hybrid retriever is robust to </w:t>
-            </w:r>
-            <w:proofErr w:type="gramStart"/>
-            <w:r>
-              <w:rPr>
-                <w:sz w:val="24"/>
-                <w:szCs w:val="24"/>
-                <w:u w:val="single"/>
-              </w:rPr>
-              <w:t>rephrasing</w:t>
-            </w:r>
-            <w:proofErr w:type="gramEnd"/>
-            <w:r>
-              <w:rPr>
-                <w:sz w:val="24"/>
-                <w:szCs w:val="24"/>
-                <w:u w:val="single"/>
-              </w:rPr>
-              <w:t xml:space="preserve"> on this test set: paraphrasing did not degrade my performance</w:t>
+              <w:t>the hybrid retriever is robust to rephrasing on this test set: paraphrasing did not degrade my performance</w:t>
             </w:r>
             <w:r>
               <w:rPr>
@@ -3434,23 +3294,7 @@
                 <w:sz w:val="24"/>
                 <w:szCs w:val="24"/>
               </w:rPr>
-              <w:t xml:space="preserve">I see high baseline correctness (97-98%) on grounded questions, strong quoting behavior that supports my trust/verification goal, and excellent robustness to rephrasing (my paraphrases scored as well as the originals). My hybrid design handles both keyword-heavy queries (BM25) and </w:t>
-            </w:r>
-            <w:proofErr w:type="gramStart"/>
-            <w:r>
-              <w:rPr>
-                <w:sz w:val="24"/>
-                <w:szCs w:val="24"/>
-              </w:rPr>
-              <w:t>semantically-worded</w:t>
-            </w:r>
-            <w:proofErr w:type="gramEnd"/>
-            <w:r>
-              <w:rPr>
-                <w:sz w:val="24"/>
-                <w:szCs w:val="24"/>
-              </w:rPr>
-              <w:t xml:space="preserve"> queries (vector), so questions phrased differently from the article text still retrieve the right document.</w:t>
+              <w:t>I see high baseline correctness (97-98%) on grounded questions, strong quoting behavior that supports my trust/verification goal, and excellent robustness to rephrasing (my paraphrases scored as well as the originals). My hybrid design handles both keyword-heavy queries (BM25) and semantically-worded queries (vector), so questions phrased differently from the article text still retrieve the right document.</w:t>
             </w:r>
           </w:p>
         </w:tc>
@@ -3546,57 +3390,15 @@
                 <w:sz w:val="24"/>
                 <w:szCs w:val="24"/>
               </w:rPr>
-              <w:t xml:space="preserve">. Because I retrieve full articles and only the top portion effectively informs the answer, precise figures </w:t>
-            </w:r>
-            <w:proofErr w:type="gramStart"/>
-            <w:r>
-              <w:rPr>
-                <w:sz w:val="24"/>
-                <w:szCs w:val="24"/>
-              </w:rPr>
-              <w:t>not present</w:t>
-            </w:r>
-            <w:proofErr w:type="gramEnd"/>
-            <w:r>
-              <w:rPr>
-                <w:sz w:val="24"/>
-                <w:szCs w:val="24"/>
-              </w:rPr>
-              <w:t xml:space="preserve"> in the retrieved/considered context are </w:t>
-            </w:r>
-            <w:proofErr w:type="gramStart"/>
-            <w:r>
-              <w:rPr>
-                <w:sz w:val="24"/>
-                <w:szCs w:val="24"/>
-              </w:rPr>
-              <w:t>missed</w:t>
-            </w:r>
-            <w:proofErr w:type="gramEnd"/>
-            <w:r>
-              <w:rPr>
-                <w:sz w:val="24"/>
-                <w:szCs w:val="24"/>
-              </w:rPr>
-              <w:t xml:space="preserve">. My binary judge also cannot credit </w:t>
-            </w:r>
-            <w:proofErr w:type="gramStart"/>
+              <w:t xml:space="preserve">. Because I retrieve full articles and only the top portion effectively informs the answer, precise figures not present in the retrieved/considered context are missed. My binary judge also cannot credit </w:t>
+            </w:r>
             <w:r>
               <w:rPr>
                 <w:sz w:val="24"/>
                 <w:szCs w:val="24"/>
                 <w:u w:val="single"/>
               </w:rPr>
-              <w:t>partially-correct</w:t>
-            </w:r>
-            <w:proofErr w:type="gramEnd"/>
-            <w:r>
-              <w:rPr>
-                <w:sz w:val="24"/>
-                <w:szCs w:val="24"/>
-                <w:u w:val="single"/>
-              </w:rPr>
-              <w:t xml:space="preserve"> answers</w:t>
+              <w:t>partially-correct answers</w:t>
             </w:r>
             <w:r>
               <w:rPr>
@@ -4625,15 +4427,7 @@
                 <w:sz w:val="24"/>
                 <w:szCs w:val="24"/>
               </w:rPr>
-              <w:t>validate_</w:t>
-            </w:r>
-            <w:proofErr w:type="gramStart"/>
-            <w:r>
-              <w:rPr>
-                <w:sz w:val="24"/>
-                <w:szCs w:val="24"/>
-              </w:rPr>
-              <w:t>framework</w:t>
+              <w:t>validate_framework</w:t>
             </w:r>
             <w:proofErr w:type="spellEnd"/>
             <w:r>
@@ -4641,15 +4435,7 @@
                 <w:sz w:val="24"/>
                 <w:szCs w:val="24"/>
               </w:rPr>
-              <w:t>(</w:t>
-            </w:r>
-            <w:proofErr w:type="gramEnd"/>
-            <w:r>
-              <w:rPr>
-                <w:sz w:val="24"/>
-                <w:szCs w:val="24"/>
-              </w:rPr>
-              <w:t>)</w:t>
+              <w:t>()</w:t>
             </w:r>
             <w:r>
               <w:rPr>
@@ -5108,27 +4894,7 @@
           <w:sz w:val="24"/>
           <w:szCs w:val="24"/>
         </w:rPr>
-        <w:t xml:space="preserve">Propose specific improvements you </w:t>
-      </w:r>
-      <w:proofErr w:type="gramStart"/>
-      <w:r>
-        <w:rPr>
-          <w:rFonts w:eastAsia="Aptos"/>
-          <w:color w:val="000000"/>
-          <w:sz w:val="24"/>
-          <w:szCs w:val="24"/>
-        </w:rPr>
-        <w:t>would</w:t>
-      </w:r>
-      <w:proofErr w:type="gramEnd"/>
-      <w:r>
-        <w:rPr>
-          <w:rFonts w:eastAsia="Aptos"/>
-          <w:color w:val="000000"/>
-          <w:sz w:val="24"/>
-          <w:szCs w:val="24"/>
-        </w:rPr>
-        <w:t xml:space="preserve"> make next.</w:t>
+        <w:t>Propose specific improvements you would make next.</w:t>
       </w:r>
     </w:p>
     <w:p>
@@ -5403,15 +5169,7 @@
                 <w:sz w:val="24"/>
                 <w:szCs w:val="24"/>
               </w:rPr>
-              <w:t xml:space="preserve"> </w:t>
-            </w:r>
-            <w:proofErr w:type="gramStart"/>
-            <w:r>
-              <w:rPr>
-                <w:sz w:val="24"/>
-                <w:szCs w:val="24"/>
-              </w:rPr>
-              <w:t>chunk</w:t>
+              <w:t xml:space="preserve"> chunk</w:t>
             </w:r>
             <w:r>
               <w:rPr>
@@ -5425,15 +5183,7 @@
                 <w:sz w:val="24"/>
                 <w:szCs w:val="24"/>
               </w:rPr>
-              <w:t xml:space="preserve"> long</w:t>
-            </w:r>
-            <w:proofErr w:type="gramEnd"/>
-            <w:r>
-              <w:rPr>
-                <w:sz w:val="24"/>
-                <w:szCs w:val="24"/>
-              </w:rPr>
-              <w:t xml:space="preserve"> articles and limit the amount of context and output tokens to improve retrieval and avoid token-budget errors.</w:t>
+              <w:t xml:space="preserve"> long articles and limit the amount of context and output tokens to improve retrieval and avoid token-budget errors.</w:t>
             </w:r>
           </w:p>
         </w:tc>
@@ -5590,9 +5340,25 @@
                 <w:sz w:val="24"/>
                 <w:szCs w:val="24"/>
               </w:rPr>
-              <w:t>test_main_</w:t>
-            </w:r>
-            <w:proofErr w:type="gramStart"/>
+              <w:t>test_main_questions.json</w:t>
+            </w:r>
+            <w:proofErr w:type="spellEnd"/>
+            <w:r>
+              <w:rPr>
+                <w:sz w:val="24"/>
+                <w:szCs w:val="24"/>
+              </w:rPr>
+              <w:t> — the 100 grounded original questions (with grading notes + source article each). This is the primary "sample queries" artifact.</w:t>
+            </w:r>
+          </w:p>
+          <w:p>
+            <w:pPr>
+              <w:rPr>
+                <w:sz w:val="24"/>
+                <w:szCs w:val="24"/>
+              </w:rPr>
+            </w:pPr>
+            <w:proofErr w:type="spellStart"/>
             <w:r>
               <w:rPr>
                 <w:b/>
@@ -5600,47 +5366,9 @@
                 <w:sz w:val="24"/>
                 <w:szCs w:val="24"/>
               </w:rPr>
-              <w:t>questions.json</w:t>
+              <w:t>testinputs_variant_questions.json</w:t>
             </w:r>
             <w:proofErr w:type="spellEnd"/>
-            <w:proofErr w:type="gramEnd"/>
-            <w:r>
-              <w:rPr>
-                <w:sz w:val="24"/>
-                <w:szCs w:val="24"/>
-              </w:rPr>
-              <w:t> — the 100 grounded original questions (with grading notes + source article each). This is the primary "sample queries" artifact.</w:t>
-            </w:r>
-          </w:p>
-          <w:p>
-            <w:pPr>
-              <w:rPr>
-                <w:sz w:val="24"/>
-                <w:szCs w:val="24"/>
-              </w:rPr>
-            </w:pPr>
-            <w:proofErr w:type="spellStart"/>
-            <w:r>
-              <w:rPr>
-                <w:b/>
-                <w:bCs/>
-                <w:sz w:val="24"/>
-                <w:szCs w:val="24"/>
-              </w:rPr>
-              <w:t>testinputs_variant_</w:t>
-            </w:r>
-            <w:proofErr w:type="gramStart"/>
-            <w:r>
-              <w:rPr>
-                <w:b/>
-                <w:bCs/>
-                <w:sz w:val="24"/>
-                <w:szCs w:val="24"/>
-              </w:rPr>
-              <w:t>questions.json</w:t>
-            </w:r>
-            <w:proofErr w:type="spellEnd"/>
-            <w:proofErr w:type="gramEnd"/>
             <w:r>
               <w:rPr>
                 <w:sz w:val="24"/>
@@ -5660,6 +5388,55 @@
               <w:right w:val="single" w:sz="6" w:space="0" w:color="BFBFBF"/>
             </w:tcBorders>
           </w:tcPr>
+          <w:p>
+            <w:pPr>
+              <w:rPr>
+                <w:sz w:val="24"/>
+                <w:szCs w:val="24"/>
+              </w:rPr>
+            </w:pPr>
+            <w:r>
+              <w:rPr>
+                <w:sz w:val="24"/>
+                <w:szCs w:val="24"/>
+              </w:rPr>
+              <w:t xml:space="preserve">Capstone </w:t>
+            </w:r>
+            <w:proofErr w:type="spellStart"/>
+            <w:r>
+              <w:rPr>
+                <w:sz w:val="24"/>
+                <w:szCs w:val="24"/>
+              </w:rPr>
+              <w:t>Github</w:t>
+            </w:r>
+            <w:proofErr w:type="spellEnd"/>
+            <w:r>
+              <w:rPr>
+                <w:sz w:val="24"/>
+                <w:szCs w:val="24"/>
+              </w:rPr>
+              <w:t xml:space="preserve"> Project</w:t>
+            </w:r>
+          </w:p>
+          <w:p>
+            <w:pPr>
+              <w:rPr>
+                <w:sz w:val="24"/>
+                <w:szCs w:val="24"/>
+              </w:rPr>
+            </w:pPr>
+            <w:hyperlink r:id="rId8" w:history="1">
+              <w:r>
+                <w:rPr>
+                  <w:rStyle w:val="Hyperlink"/>
+                  <w:sz w:val="24"/>
+                  <w:szCs w:val="24"/>
+                </w:rPr>
+                <w:t>https://github.com/miguelangelherrera77-blip/MIT_CAPSTONE</w:t>
+              </w:r>
+            </w:hyperlink>
+          </w:p>
           <w:p>
             <w:pPr>
               <w:rPr>
@@ -5852,6 +5629,55 @@
                 <w:szCs w:val="24"/>
               </w:rPr>
             </w:pPr>
+            <w:r>
+              <w:rPr>
+                <w:sz w:val="24"/>
+                <w:szCs w:val="24"/>
+              </w:rPr>
+              <w:t xml:space="preserve">Capstone </w:t>
+            </w:r>
+            <w:proofErr w:type="spellStart"/>
+            <w:r>
+              <w:rPr>
+                <w:sz w:val="24"/>
+                <w:szCs w:val="24"/>
+              </w:rPr>
+              <w:t>Github</w:t>
+            </w:r>
+            <w:proofErr w:type="spellEnd"/>
+            <w:r>
+              <w:rPr>
+                <w:sz w:val="24"/>
+                <w:szCs w:val="24"/>
+              </w:rPr>
+              <w:t xml:space="preserve"> Project</w:t>
+            </w:r>
+          </w:p>
+          <w:p>
+            <w:pPr>
+              <w:rPr>
+                <w:sz w:val="24"/>
+                <w:szCs w:val="24"/>
+              </w:rPr>
+            </w:pPr>
+            <w:hyperlink r:id="rId9" w:history="1">
+              <w:r>
+                <w:rPr>
+                  <w:rStyle w:val="Hyperlink"/>
+                  <w:sz w:val="24"/>
+                  <w:szCs w:val="24"/>
+                </w:rPr>
+                <w:t>https://github.com/miguelangelherrera77-blip/MIT_CAPSTONE</w:t>
+              </w:r>
+            </w:hyperlink>
+          </w:p>
+          <w:p>
+            <w:pPr>
+              <w:rPr>
+                <w:sz w:val="24"/>
+                <w:szCs w:val="24"/>
+              </w:rPr>
+            </w:pPr>
           </w:p>
         </w:tc>
       </w:tr>
@@ -5954,22 +5780,6 @@
               <w:t> — the test-set generators.</w:t>
             </w:r>
           </w:p>
-          <w:p>
-            <w:pPr>
-              <w:rPr>
-                <w:sz w:val="24"/>
-                <w:szCs w:val="24"/>
-              </w:rPr>
-            </w:pPr>
-          </w:p>
-          <w:p>
-            <w:pPr>
-              <w:rPr>
-                <w:sz w:val="24"/>
-                <w:szCs w:val="24"/>
-              </w:rPr>
-            </w:pPr>
-          </w:p>
         </w:tc>
         <w:tc>
           <w:tcPr>
@@ -5996,6 +5806,55 @@
                 <w:szCs w:val="24"/>
               </w:rPr>
             </w:pPr>
+          </w:p>
+          <w:p>
+            <w:pPr>
+              <w:rPr>
+                <w:sz w:val="24"/>
+                <w:szCs w:val="24"/>
+              </w:rPr>
+            </w:pPr>
+            <w:r>
+              <w:rPr>
+                <w:sz w:val="24"/>
+                <w:szCs w:val="24"/>
+              </w:rPr>
+              <w:t xml:space="preserve">Capstone </w:t>
+            </w:r>
+            <w:proofErr w:type="spellStart"/>
+            <w:r>
+              <w:rPr>
+                <w:sz w:val="24"/>
+                <w:szCs w:val="24"/>
+              </w:rPr>
+              <w:t>Github</w:t>
+            </w:r>
+            <w:proofErr w:type="spellEnd"/>
+            <w:r>
+              <w:rPr>
+                <w:sz w:val="24"/>
+                <w:szCs w:val="24"/>
+              </w:rPr>
+              <w:t xml:space="preserve"> Project</w:t>
+            </w:r>
+          </w:p>
+          <w:p>
+            <w:pPr>
+              <w:rPr>
+                <w:sz w:val="24"/>
+                <w:szCs w:val="24"/>
+              </w:rPr>
+            </w:pPr>
+            <w:hyperlink r:id="rId10" w:history="1">
+              <w:r>
+                <w:rPr>
+                  <w:rStyle w:val="Hyperlink"/>
+                  <w:sz w:val="24"/>
+                  <w:szCs w:val="24"/>
+                </w:rPr>
+                <w:t>https://github.com/miguelangelherrera77-blip/MIT_CAPSTONE</w:t>
+              </w:r>
+            </w:hyperlink>
           </w:p>
           <w:p>
             <w:pPr>
@@ -6169,10 +6028,10 @@
       </w:r>
     </w:p>
     <w:sectPr>
-      <w:headerReference w:type="even" r:id="rId8"/>
-      <w:headerReference w:type="default" r:id="rId9"/>
-      <w:footerReference w:type="default" r:id="rId10"/>
-      <w:headerReference w:type="first" r:id="rId11"/>
+      <w:headerReference w:type="even" r:id="rId11"/>
+      <w:headerReference w:type="default" r:id="rId12"/>
+      <w:footerReference w:type="default" r:id="rId13"/>
+      <w:headerReference w:type="first" r:id="rId14"/>
       <w:pgSz w:w="12240" w:h="15840"/>
       <w:pgMar w:top="1440" w:right="567" w:bottom="1440" w:left="567" w:header="57" w:footer="170" w:gutter="0"/>
       <w:pgNumType w:start="1"/>
@@ -8689,6 +8548,18 @@
       <w:contextualSpacing/>
     </w:pPr>
   </w:style>
+  <w:style w:type="character" w:styleId="UnresolvedMention">
+    <w:name w:val="Unresolved Mention"/>
+    <w:basedOn w:val="DefaultParagraphFont"/>
+    <w:uiPriority w:val="99"/>
+    <w:semiHidden/>
+    <w:unhideWhenUsed/>
+    <w:rsid w:val="00661016"/>
+    <w:rPr>
+      <w:color w:val="605E5C"/>
+      <w:shd w:val="clear" w:color="auto" w:fill="E1DFDD"/>
+    </w:rPr>
+  </w:style>
 </w:styles>
 </file>
 

</xml_diff>